<commit_message>
Sync CV docx with website address filled in
Co-Authored-By: Claude Opus 4.8 <noreply@anthropic.com>
</commit_message>
<xml_diff>
--- a/files/Simon_CV_uconn_May2026.docx
+++ b/files/Simon_CV_uconn_May2026.docx
@@ -91,7 +91,7 @@
         <w:tab/>
       </w:r>
       <w:r>
-        <w:t xml:space="preserve">website: </w:t>
+        <w:t>website: davidsimon-econ.github.io</w:t>
       </w:r>
     </w:p>
     <w:p>
@@ -351,16 +351,11 @@
       <w:r>
         <w:t>Faculty Affiliate, Institute for Collaboration on Health, Intervention, and Policy (</w:t>
       </w:r>
-      <w:proofErr w:type="spellStart"/>
       <w:r>
         <w:t>In</w:t>
       </w:r>
       <w:r>
-        <w:t>CHIP</w:t>
-      </w:r>
-      <w:proofErr w:type="spellEnd"/>
-      <w:r>
-        <w:t>), University of Connecticut, 2014-present</w:t>
+        <w:t>CHIP), University of Connecticut, 2014-present</w:t>
       </w:r>
     </w:p>
     <w:p>
@@ -778,16 +773,11 @@
         <w:t>2025</w:t>
       </w:r>
       <w:r>
-        <w:t xml:space="preserve"> </w:t>
-      </w:r>
-      <w:proofErr w:type="gramStart"/>
-      <w:r>
-        <w:t xml:space="preserve">   </w:t>
+        <w:t xml:space="preserve">    </w:t>
       </w:r>
       <w:r>
         <w:t>“</w:t>
       </w:r>
-      <w:proofErr w:type="gramEnd"/>
       <w:r>
         <w:fldChar w:fldCharType="begin"/>
       </w:r>
@@ -1062,23 +1052,7 @@
           <w:color w:val="000000"/>
           <w:shd w:val="clear" w:color="auto" w:fill="FFFFFF"/>
         </w:rPr>
-        <w:t xml:space="preserve">“The Impact of the Covid Pandemic on the Health and Wellbeing of Pre-school Aged Children” (with </w:t>
-      </w:r>
-      <w:proofErr w:type="spellStart"/>
-      <w:r>
-        <w:rPr>
-          <w:color w:val="000000"/>
-          <w:shd w:val="clear" w:color="auto" w:fill="FFFFFF"/>
-        </w:rPr>
-        <w:t>Sirui</w:t>
-      </w:r>
-      <w:proofErr w:type="spellEnd"/>
-      <w:r>
-        <w:rPr>
-          <w:color w:val="000000"/>
-          <w:shd w:val="clear" w:color="auto" w:fill="FFFFFF"/>
-        </w:rPr>
-        <w:t xml:space="preserve"> Qiu). </w:t>
+        <w:t xml:space="preserve">“The Impact of the Covid Pandemic on the Health and Wellbeing of Pre-school Aged Children” (with Sirui Qiu). </w:t>
       </w:r>
       <w:r>
         <w:rPr>
@@ -1128,15 +1102,7 @@
           <w:i/>
           <w:iCs/>
         </w:rPr>
-        <w:t xml:space="preserve"> Journal of Econometric </w:t>
-      </w:r>
-      <w:proofErr w:type="gramStart"/>
-      <w:r>
-        <w:rPr>
-          <w:i/>
-          <w:iCs/>
-        </w:rPr>
-        <w:t>Methods</w:t>
+        <w:t xml:space="preserve"> Journal of Econometric Methods</w:t>
       </w:r>
       <w:r>
         <w:rPr>
@@ -1153,11 +1119,7 @@
         <w:t>,</w:t>
       </w:r>
       <w:r>
-        <w:t>Vol</w:t>
-      </w:r>
-      <w:proofErr w:type="gramEnd"/>
-      <w:r>
-        <w:t xml:space="preserve"> 13, No 1, </w:t>
+        <w:t xml:space="preserve">Vol 13, No 1, </w:t>
       </w:r>
       <w:r>
         <w:t>pages: 67-95.</w:t>
@@ -1635,14 +1597,7 @@
           <w:rPr>
             <w:rStyle w:val="Hyperlink"/>
           </w:rPr>
-          <w:t xml:space="preserve">The Impact of Stock Market Fluctuations on the Mental </w:t>
-        </w:r>
-        <w:proofErr w:type="gramStart"/>
-        <w:r>
-          <w:rPr>
-            <w:rStyle w:val="Hyperlink"/>
-          </w:rPr>
-          <w:t>and</w:t>
+          <w:t>The Impact of Stock Market Fluctuations on the Mental and</w:t>
         </w:r>
         <w:r>
           <w:rPr>
@@ -1654,14 +1609,7 @@
           <w:rPr>
             <w:rStyle w:val="Hyperlink"/>
           </w:rPr>
-          <w:t>Physical</w:t>
-        </w:r>
-        <w:proofErr w:type="gramEnd"/>
-        <w:r>
-          <w:rPr>
-            <w:rStyle w:val="Hyperlink"/>
-          </w:rPr>
-          <w:t xml:space="preserve"> Well</w:t>
+          <w:t>Physical Well</w:t>
         </w:r>
         <w:r>
           <w:rPr>
@@ -2040,10 +1988,7 @@
         <w:t>Investigations for Child Maltreatment and Family Outcomes</w:t>
       </w:r>
       <w:r>
-        <w:t>” (With Lindsey Lacey and Katherine Rittenhouse)</w:t>
-      </w:r>
-      <w:r>
-        <w:t xml:space="preserve">.  </w:t>
+        <w:t xml:space="preserve">” (With Lindsey Lacey and Katherine Rittenhouse).  </w:t>
       </w:r>
       <w:r>
         <w:rPr>
@@ -2076,13 +2021,8 @@
       <w:r>
         <w:t xml:space="preserve">”  (With Aaron Sojourner, Heidi </w:t>
       </w:r>
-      <w:proofErr w:type="spellStart"/>
-      <w:r>
-        <w:t>Ombisa</w:t>
-      </w:r>
-      <w:proofErr w:type="spellEnd"/>
-      <w:r>
-        <w:t xml:space="preserve"> Skallet</w:t>
+      <w:r>
+        <w:t>Ombisa Skallet</w:t>
       </w:r>
       <w:r>
         <w:t>, and Jon Pedersen)</w:t>
@@ -2625,21 +2565,7 @@
           <w:rPr>
             <w:rStyle w:val="Hyperlink"/>
           </w:rPr>
-          <w:t xml:space="preserve">New legislation on the EITC will reduce poverty and promote </w:t>
-        </w:r>
-        <w:proofErr w:type="spellStart"/>
-        <w:r>
-          <w:rPr>
-            <w:rStyle w:val="Hyperlink"/>
-          </w:rPr>
-          <w:t>self sufficiency</w:t>
-        </w:r>
-        <w:proofErr w:type="spellEnd"/>
-        <w:r>
-          <w:rPr>
-            <w:rStyle w:val="Hyperlink"/>
-          </w:rPr>
-          <w:t>.”</w:t>
+          <w:t>New legislation on the EITC will reduce poverty and promote self sufficiency.”</w:t>
         </w:r>
       </w:hyperlink>
       <w:r>
@@ -2712,23 +2638,14 @@
         </w:r>
       </w:hyperlink>
       <w:r>
-        <w:t xml:space="preserve">t”. </w:t>
-      </w:r>
-      <w:proofErr w:type="spellStart"/>
-      <w:r>
-        <w:t>Econofact</w:t>
-      </w:r>
-      <w:proofErr w:type="spellEnd"/>
-      <w:r>
-        <w:t xml:space="preserve">, December 2020.  </w:t>
-      </w:r>
-    </w:p>
-    <w:p>
-      <w:pPr>
-        <w:ind w:left="720"/>
-      </w:pPr>
-      <w:r>
-        <w:lastRenderedPageBreak/>
+        <w:t xml:space="preserve">t”. Econofact, December 2020.  </w:t>
+      </w:r>
+    </w:p>
+    <w:p>
+      <w:pPr>
+        <w:ind w:left="720"/>
+      </w:pPr>
+      <w:r>
         <w:t>“Expansions to the Earned Income Tax Credit Improved the Health of Children Born to Low Income Mothers</w:t>
       </w:r>
       <w:r>
@@ -2963,76 +2880,84 @@
         <w:t>A</w:t>
       </w:r>
       <w:r>
-        <w:t xml:space="preserve"> tuition grant for the </w:t>
-      </w:r>
-      <w:proofErr w:type="spellStart"/>
-      <w:r>
-        <w:t>Uconn</w:t>
-      </w:r>
-      <w:proofErr w:type="spellEnd"/>
-      <w:r>
+        <w:t xml:space="preserve"> tuition grant for the Uconn Masters in Quantitative Economics program for a women or under-represented minority scholar.</w:t>
+      </w:r>
+      <w:r>
+        <w:t xml:space="preserve"> 2020-</w:t>
+      </w:r>
+      <w:r>
+        <w:rPr>
+          <w:i/>
+          <w:iCs/>
+        </w:rPr>
+        <w:t>present</w:t>
+      </w:r>
+    </w:p>
+    <w:p>
+      <w:pPr>
+        <w:ind w:left="720"/>
+      </w:pPr>
+    </w:p>
+    <w:p>
+      <w:pPr>
+        <w:ind w:left="720"/>
+      </w:pPr>
+      <w:r>
+        <w:t xml:space="preserve">Referee: </w:t>
+      </w:r>
+      <w:r>
+        <w:rPr>
+          <w:i/>
+        </w:rPr>
+        <w:t>The A</w:t>
+      </w:r>
+      <w:r>
+        <w:rPr>
+          <w:i/>
+        </w:rPr>
+        <w:t>merican Econo</w:t>
+      </w:r>
+      <w:r>
+        <w:rPr>
+          <w:i/>
+        </w:rPr>
+        <w:t xml:space="preserve">mic Review, </w:t>
+      </w:r>
+      <w:r>
+        <w:rPr>
+          <w:i/>
+        </w:rPr>
+        <w:t>The Quarterly Journal of Economics,</w:t>
+      </w:r>
+      <w:r>
+        <w:rPr>
+          <w:i/>
+        </w:rPr>
+        <w:t xml:space="preserve"> The Journal of Political Economy,</w:t>
+      </w:r>
+      <w:r>
+        <w:rPr>
+          <w:i/>
+        </w:rPr>
         <w:t xml:space="preserve"> </w:t>
       </w:r>
-      <w:proofErr w:type="gramStart"/>
-      <w:r>
-        <w:t>Masters</w:t>
-      </w:r>
-      <w:proofErr w:type="gramEnd"/>
-      <w:r>
-        <w:t xml:space="preserve"> in Quantitative Economics program for a women or under-represented minority scholar.</w:t>
-      </w:r>
-      <w:r>
-        <w:t xml:space="preserve"> 2020-</w:t>
-      </w:r>
-      <w:r>
-        <w:rPr>
-          <w:i/>
-          <w:iCs/>
-        </w:rPr>
-        <w:t>present</w:t>
-      </w:r>
-    </w:p>
-    <w:p>
-      <w:pPr>
-        <w:ind w:left="720"/>
-      </w:pPr>
-    </w:p>
-    <w:p>
-      <w:pPr>
-        <w:ind w:left="720"/>
-      </w:pPr>
-      <w:r>
-        <w:t xml:space="preserve">Referee: </w:t>
-      </w:r>
-      <w:r>
-        <w:rPr>
-          <w:i/>
-        </w:rPr>
-        <w:t>The A</w:t>
-      </w:r>
-      <w:r>
-        <w:rPr>
-          <w:i/>
-        </w:rPr>
-        <w:t>merican Econo</w:t>
-      </w:r>
-      <w:r>
-        <w:rPr>
-          <w:i/>
-        </w:rPr>
-        <w:t xml:space="preserve">mic Review, </w:t>
-      </w:r>
-      <w:r>
-        <w:rPr>
-          <w:i/>
-        </w:rPr>
-        <w:t>The Quarterly Journal of Economics,</w:t>
-      </w:r>
-      <w:r>
-        <w:rPr>
-          <w:i/>
-        </w:rPr>
-        <w:t xml:space="preserve"> The Journal of Political Economy,</w:t>
+      <w:r>
+        <w:rPr>
+          <w:i/>
+        </w:rPr>
+        <w:t>Ameri</w:t>
+      </w:r>
+      <w:r>
+        <w:rPr>
+          <w:i/>
+        </w:rPr>
+        <w:t xml:space="preserve">can Economic Journal: Economic </w:t>
+      </w:r>
+      <w:r>
+        <w:rPr>
+          <w:i/>
+        </w:rPr>
+        <w:t>Policy,</w:t>
       </w:r>
       <w:r>
         <w:rPr>
@@ -3044,19 +2969,43 @@
         <w:rPr>
           <w:i/>
         </w:rPr>
-        <w:t>Ameri</w:t>
-      </w:r>
-      <w:r>
-        <w:rPr>
-          <w:i/>
-        </w:rPr>
-        <w:t xml:space="preserve">can Economic Journal: Economic </w:t>
-      </w:r>
-      <w:r>
-        <w:rPr>
-          <w:i/>
-        </w:rPr>
-        <w:t>Policy,</w:t>
+        <w:t xml:space="preserve">The National Science Foundation, </w:t>
+      </w:r>
+      <w:r>
+        <w:rPr>
+          <w:i/>
+        </w:rPr>
+        <w:t xml:space="preserve">Journal of Public Economics, </w:t>
+      </w:r>
+      <w:r>
+        <w:rPr>
+          <w:i/>
+        </w:rPr>
+        <w:t xml:space="preserve">Journal of Human Resources, </w:t>
+      </w:r>
+      <w:r>
+        <w:rPr>
+          <w:i/>
+        </w:rPr>
+        <w:t>Journal of Labor Economics</w:t>
+      </w:r>
+      <w:r>
+        <w:rPr>
+          <w:i/>
+        </w:rPr>
+        <w:t>, Journal of</w:t>
+      </w:r>
+      <w:r>
+        <w:rPr>
+          <w:i/>
+        </w:rPr>
+        <w:t xml:space="preserve"> the</w:t>
+      </w:r>
+      <w:r>
+        <w:rPr>
+          <w:i/>
+        </w:rPr>
+        <w:t xml:space="preserve"> European Economic Association, </w:t>
       </w:r>
       <w:r>
         <w:rPr>
@@ -3068,43 +3017,13 @@
         <w:rPr>
           <w:i/>
         </w:rPr>
-        <w:t xml:space="preserve">The National Science Foundation, </w:t>
-      </w:r>
-      <w:r>
-        <w:rPr>
-          <w:i/>
-        </w:rPr>
-        <w:t xml:space="preserve">Journal of Public Economics, </w:t>
-      </w:r>
-      <w:r>
-        <w:rPr>
-          <w:i/>
-        </w:rPr>
-        <w:t xml:space="preserve">Journal of Human Resources, </w:t>
-      </w:r>
-      <w:r>
-        <w:rPr>
-          <w:i/>
-        </w:rPr>
-        <w:t>Journal of Labor Economics</w:t>
-      </w:r>
-      <w:r>
-        <w:rPr>
-          <w:i/>
-        </w:rPr>
-        <w:t>, Journal of</w:t>
-      </w:r>
-      <w:r>
-        <w:rPr>
-          <w:i/>
-        </w:rPr>
-        <w:t xml:space="preserve"> the</w:t>
-      </w:r>
-      <w:r>
-        <w:rPr>
-          <w:i/>
-        </w:rPr>
-        <w:t xml:space="preserve"> European Economic Association, </w:t>
+        <w:t xml:space="preserve">Journal of Health Economics, </w:t>
+      </w:r>
+      <w:r>
+        <w:rPr>
+          <w:i/>
+        </w:rPr>
+        <w:t>Journal  of Policy Analysis and Management,</w:t>
       </w:r>
       <w:r>
         <w:rPr>
@@ -3116,13 +3035,13 @@
         <w:rPr>
           <w:i/>
         </w:rPr>
-        <w:t xml:space="preserve">Journal of Health Economics, </w:t>
-      </w:r>
-      <w:r>
-        <w:rPr>
-          <w:i/>
-        </w:rPr>
-        <w:t>Journal  of Policy Analysis and Management,</w:t>
+        <w:t xml:space="preserve">American Journal of Health Economics, </w:t>
+      </w:r>
+      <w:r>
+        <w:rPr>
+          <w:i/>
+        </w:rPr>
+        <w:t>Labour Economics,</w:t>
       </w:r>
       <w:r>
         <w:rPr>
@@ -3134,21 +3053,25 @@
         <w:rPr>
           <w:i/>
         </w:rPr>
-        <w:t xml:space="preserve">American Journal of Health Economics, </w:t>
-      </w:r>
-      <w:proofErr w:type="spellStart"/>
-      <w:r>
-        <w:rPr>
-          <w:i/>
-        </w:rPr>
-        <w:t>Labour</w:t>
-      </w:r>
-      <w:proofErr w:type="spellEnd"/>
-      <w:r>
-        <w:rPr>
-          <w:i/>
-        </w:rPr>
-        <w:t xml:space="preserve"> Economics,</w:t>
+        <w:t xml:space="preserve">Economics of Education Review, Economic Inquiry, </w:t>
+      </w:r>
+      <w:r>
+        <w:rPr>
+          <w:i/>
+        </w:rPr>
+        <w:t>Health Economics</w:t>
+      </w:r>
+      <w:r>
+        <w:rPr>
+          <w:i/>
+        </w:rPr>
+        <w:t xml:space="preserve">, </w:t>
+      </w:r>
+      <w:r>
+        <w:rPr>
+          <w:i/>
+        </w:rPr>
+        <w:t>Journal</w:t>
       </w:r>
       <w:r>
         <w:rPr>
@@ -3160,25 +3083,13 @@
         <w:rPr>
           <w:i/>
         </w:rPr>
-        <w:t xml:space="preserve">Economics of Education Review, Economic Inquiry, </w:t>
-      </w:r>
-      <w:r>
-        <w:rPr>
-          <w:i/>
-        </w:rPr>
-        <w:t>Health Economics</w:t>
-      </w:r>
-      <w:r>
-        <w:rPr>
-          <w:i/>
-        </w:rPr>
-        <w:t xml:space="preserve">, </w:t>
-      </w:r>
-      <w:r>
-        <w:rPr>
-          <w:i/>
-        </w:rPr>
-        <w:t>Journal</w:t>
+        <w:t>of Population Economics</w:t>
+      </w:r>
+      <w:r>
+        <w:rPr>
+          <w:i/>
+        </w:rPr>
+        <w:t>,</w:t>
       </w:r>
       <w:r>
         <w:rPr>
@@ -3190,13 +3101,13 @@
         <w:rPr>
           <w:i/>
         </w:rPr>
-        <w:t>of Population Economics</w:t>
-      </w:r>
-      <w:r>
-        <w:rPr>
-          <w:i/>
-        </w:rPr>
-        <w:t>,</w:t>
+        <w:t xml:space="preserve">Journal of Economic Behavior and Organization, </w:t>
+      </w:r>
+      <w:r>
+        <w:rPr>
+          <w:i/>
+        </w:rPr>
+        <w:t>National Tax Journal,</w:t>
       </w:r>
       <w:r>
         <w:rPr>
@@ -3208,13 +3119,61 @@
         <w:rPr>
           <w:i/>
         </w:rPr>
-        <w:t xml:space="preserve">Journal of Economic Behavior and Organization, </w:t>
-      </w:r>
-      <w:r>
-        <w:rPr>
-          <w:i/>
-        </w:rPr>
-        <w:t>National Tax Journal,</w:t>
+        <w:t xml:space="preserve">Health Affairs, </w:t>
+      </w:r>
+      <w:r>
+        <w:rPr>
+          <w:i/>
+        </w:rPr>
+        <w:t xml:space="preserve">Education Finance and Policy, </w:t>
+      </w:r>
+      <w:r>
+        <w:rPr>
+          <w:i/>
+        </w:rPr>
+        <w:t xml:space="preserve">PLOS one, </w:t>
+      </w:r>
+      <w:r>
+        <w:rPr>
+          <w:i/>
+        </w:rPr>
+        <w:t xml:space="preserve">The Milbank Quarterly, </w:t>
+      </w:r>
+      <w:r>
+        <w:rPr>
+          <w:i/>
+        </w:rPr>
+        <w:t xml:space="preserve">Review of the Economics of the Household, </w:t>
+      </w:r>
+      <w:r>
+        <w:rPr>
+          <w:i/>
+        </w:rPr>
+        <w:t>Economics of Human Biology,</w:t>
+      </w:r>
+      <w:r>
+        <w:rPr>
+          <w:i/>
+        </w:rPr>
+        <w:t xml:space="preserve"> Eastern Economic Journal,</w:t>
+      </w:r>
+      <w:r>
+        <w:rPr>
+          <w:i/>
+        </w:rPr>
+        <w:t xml:space="preserve"> European Journal of Health Economics,</w:t>
+      </w:r>
+      <w:r>
+        <w:rPr>
+          <w:i/>
+        </w:rPr>
+        <w:t xml:space="preserve"> World Development,</w:t>
+      </w:r>
+      <w:r>
+        <w:rPr>
+          <w:i/>
+        </w:rPr>
+        <w:t xml:space="preserve"> Research on Aging,</w:t>
       </w:r>
       <w:r>
         <w:rPr>
@@ -3225,72 +3184,6 @@
       <w:r>
         <w:rPr>
           <w:i/>
-        </w:rPr>
-        <w:t xml:space="preserve">Health Affairs, </w:t>
-      </w:r>
-      <w:r>
-        <w:rPr>
-          <w:i/>
-        </w:rPr>
-        <w:t xml:space="preserve">Education Finance and Policy, </w:t>
-      </w:r>
-      <w:r>
-        <w:rPr>
-          <w:i/>
-        </w:rPr>
-        <w:t xml:space="preserve">PLOS one, </w:t>
-      </w:r>
-      <w:r>
-        <w:rPr>
-          <w:i/>
-        </w:rPr>
-        <w:t xml:space="preserve">The Milbank Quarterly, </w:t>
-      </w:r>
-      <w:r>
-        <w:rPr>
-          <w:i/>
-        </w:rPr>
-        <w:t xml:space="preserve">Review of the Economics of the Household, </w:t>
-      </w:r>
-      <w:r>
-        <w:rPr>
-          <w:i/>
-        </w:rPr>
-        <w:t>Economics of Human Biology,</w:t>
-      </w:r>
-      <w:r>
-        <w:rPr>
-          <w:i/>
-        </w:rPr>
-        <w:t xml:space="preserve"> Eastern Economic Journal,</w:t>
-      </w:r>
-      <w:r>
-        <w:rPr>
-          <w:i/>
-        </w:rPr>
-        <w:t xml:space="preserve"> European Journal of Health Economics,</w:t>
-      </w:r>
-      <w:r>
-        <w:rPr>
-          <w:i/>
-        </w:rPr>
-        <w:t xml:space="preserve"> World Development,</w:t>
-      </w:r>
-      <w:r>
-        <w:rPr>
-          <w:i/>
-        </w:rPr>
-        <w:t xml:space="preserve"> Research on Aging,</w:t>
-      </w:r>
-      <w:r>
-        <w:rPr>
-          <w:i/>
-        </w:rPr>
-        <w:t xml:space="preserve"> </w:t>
-      </w:r>
-      <w:r>
-        <w:rPr>
-          <w:i/>
           <w:color w:val="222222"/>
           <w:shd w:val="clear" w:color="auto" w:fill="FFFFFF"/>
         </w:rPr>
@@ -3317,7 +3210,6 @@
         <w:rPr>
           <w:b/>
         </w:rPr>
-        <w:lastRenderedPageBreak/>
         <w:t>Work Referenced in Media</w:t>
       </w:r>
       <w:r>
@@ -3444,7 +3336,6 @@
         </w:rPr>
         <w:t xml:space="preserve">, 2024. </w:t>
       </w:r>
-      <w:proofErr w:type="spellStart"/>
       <w:r>
         <w:rPr>
           <w:bCs/>
@@ -3453,7 +3344,6 @@
         </w:rPr>
         <w:t>MinnPost</w:t>
       </w:r>
-      <w:proofErr w:type="spellEnd"/>
       <w:r>
         <w:rPr>
           <w:bCs/>
@@ -3576,7 +3466,6 @@
         </w:rPr>
         <w:t xml:space="preserve">, 2021. </w:t>
       </w:r>
-      <w:proofErr w:type="spellStart"/>
       <w:r>
         <w:rPr>
           <w:bCs/>
@@ -3585,7 +3474,6 @@
         </w:rPr>
         <w:t>FutureEd</w:t>
       </w:r>
-      <w:proofErr w:type="spellEnd"/>
     </w:p>
     <w:p>
       <w:pPr>
@@ -4116,19 +4004,11 @@
         </w:rPr>
         <w:t xml:space="preserve">, 2019. </w:t>
       </w:r>
-      <w:proofErr w:type="spellStart"/>
-      <w:r>
-        <w:rPr>
-          <w:i/>
-        </w:rPr>
-        <w:t>Capitalisn’t</w:t>
-      </w:r>
-      <w:proofErr w:type="spellEnd"/>
-      <w:r>
-        <w:rPr>
-          <w:i/>
-        </w:rPr>
-        <w:t xml:space="preserve"> podcast, episode 33, Chicago Booth Review.</w:t>
+      <w:r>
+        <w:rPr>
+          <w:i/>
+        </w:rPr>
+        <w:t>Capitalisn’t podcast, episode 33, Chicago Booth Review.</w:t>
       </w:r>
       <w:r>
         <w:rPr>
@@ -4261,21 +4141,7 @@
           <w:rPr>
             <w:rStyle w:val="Hyperlink"/>
           </w:rPr>
-          <w:t xml:space="preserve">Medical Marijuana Legalization Leads to Baby </w:t>
-        </w:r>
-        <w:proofErr w:type="spellStart"/>
-        <w:r>
-          <w:rPr>
-            <w:rStyle w:val="Hyperlink"/>
-          </w:rPr>
-          <w:t>Boomlet</w:t>
-        </w:r>
-        <w:proofErr w:type="spellEnd"/>
-        <w:r>
-          <w:rPr>
-            <w:rStyle w:val="Hyperlink"/>
-          </w:rPr>
-          <w:t>, Paper Says</w:t>
+          <w:t>Medical Marijuana Legalization Leads to Baby Boomlet, Paper Says</w:t>
         </w:r>
       </w:hyperlink>
       <w:r>
@@ -4569,7 +4435,6 @@
         <w:rPr>
           <w:iCs/>
         </w:rPr>
-        <w:lastRenderedPageBreak/>
         <w:t>2026</w:t>
       </w:r>
     </w:p>
@@ -4727,869 +4592,846 @@
         <w:rPr>
           <w:iCs/>
         </w:rPr>
-        <w:t xml:space="preserve">NBER Spring Meeting of Family and Children’s </w:t>
-      </w:r>
-      <w:proofErr w:type="gramStart"/>
-      <w:r>
-        <w:rPr>
-          <w:iCs/>
-        </w:rPr>
-        <w:t>working group</w:t>
-      </w:r>
-      <w:proofErr w:type="gramEnd"/>
-      <w:r>
-        <w:rPr>
-          <w:iCs/>
-        </w:rPr>
+        <w:t>NBER Spring Meeting of Family and Children’s working group, April</w:t>
+      </w:r>
+      <w:r>
+        <w:rPr>
+          <w:iCs/>
+        </w:rPr>
+        <w:t>.</w:t>
+      </w:r>
+    </w:p>
+    <w:p>
+      <w:pPr>
+        <w:ind w:left="720"/>
+        <w:rPr>
+          <w:iCs/>
+        </w:rPr>
+      </w:pPr>
+      <w:r>
+        <w:rPr>
+          <w:iCs/>
+        </w:rPr>
+        <w:t>Atlanta Workshop on Public Policy and Child Wellbeing, March.</w:t>
+      </w:r>
+    </w:p>
+    <w:p>
+      <w:pPr>
+        <w:ind w:left="720"/>
+        <w:rPr>
+          <w:iCs/>
+        </w:rPr>
+      </w:pPr>
+      <w:r>
+        <w:rPr>
+          <w:iCs/>
+        </w:rPr>
+        <w:t>Atlanta Workshop on Public Policy and Child Wellbeing, March.</w:t>
+      </w:r>
+    </w:p>
+    <w:p>
+      <w:pPr>
+        <w:ind w:left="720"/>
+        <w:rPr>
+          <w:iCs/>
+        </w:rPr>
+      </w:pPr>
+      <w:r>
+        <w:rPr>
+          <w:iCs/>
+        </w:rPr>
+        <w:t xml:space="preserve">University of Massachusetts Amherst, Department of </w:t>
+      </w:r>
+      <w:r>
+        <w:rPr>
+          <w:iCs/>
+        </w:rPr>
+        <w:t xml:space="preserve">Resource </w:t>
+      </w:r>
+      <w:r>
+        <w:rPr>
+          <w:iCs/>
+        </w:rPr>
+        <w:t xml:space="preserve">Economics, </w:t>
+      </w:r>
+      <w:r>
+        <w:rPr>
+          <w:iCs/>
+        </w:rPr>
+        <w:t>March.</w:t>
+      </w:r>
+    </w:p>
+    <w:p>
+      <w:pPr>
+        <w:ind w:left="720"/>
+        <w:rPr>
+          <w:iCs/>
+        </w:rPr>
+      </w:pPr>
+      <w:r>
+        <w:rPr>
+          <w:iCs/>
+        </w:rPr>
+        <w:t>2023</w:t>
+      </w:r>
+    </w:p>
+    <w:p>
+      <w:pPr>
+        <w:ind w:left="720"/>
+        <w:rPr>
+          <w:iCs/>
+        </w:rPr>
+      </w:pPr>
+      <w:r>
+        <w:rPr>
+          <w:iCs/>
+        </w:rPr>
+        <w:t xml:space="preserve">University of Pittsburgh, Department of Economics, </w:t>
+      </w:r>
+      <w:r>
+        <w:rPr>
+          <w:iCs/>
+        </w:rPr>
+        <w:t>Department of Economics, October</w:t>
+      </w:r>
+    </w:p>
+    <w:p>
+      <w:pPr>
+        <w:ind w:left="720"/>
+        <w:rPr>
+          <w:iCs/>
+        </w:rPr>
+      </w:pPr>
+      <w:r>
+        <w:rPr>
+          <w:iCs/>
+        </w:rPr>
+        <w:t>Atlanta Workshop on Public Policy and Child Wellbeing, March.</w:t>
+      </w:r>
+    </w:p>
+    <w:p>
+      <w:pPr>
+        <w:ind w:left="720"/>
+        <w:rPr>
+          <w:iCs/>
+        </w:rPr>
+      </w:pPr>
+      <w:r>
+        <w:rPr>
+          <w:iCs/>
+        </w:rPr>
+        <w:t>Eastern Economic Association, Annual Meeting, February.</w:t>
+      </w:r>
+    </w:p>
+    <w:p>
+      <w:pPr>
+        <w:ind w:left="720"/>
+        <w:rPr>
+          <w:i/>
+        </w:rPr>
+      </w:pPr>
+      <w:r>
+        <w:rPr>
+          <w:i/>
+        </w:rPr>
+        <w:t>2022</w:t>
+      </w:r>
+    </w:p>
+    <w:p>
+      <w:pPr>
+        <w:ind w:left="720"/>
+        <w:rPr>
+          <w:iCs/>
+        </w:rPr>
+      </w:pPr>
+      <w:r>
+        <w:rPr>
+          <w:iCs/>
+        </w:rPr>
+        <w:t>NBER SI Children’s Meeting, presenting: “Time in Foster Care, Incentives to Adopt, and Child Outcomes.”, July</w:t>
+      </w:r>
+    </w:p>
+    <w:p>
+      <w:pPr>
+        <w:ind w:left="720"/>
+        <w:rPr>
+          <w:iCs/>
+        </w:rPr>
+      </w:pPr>
+      <w:r>
+        <w:rPr>
+          <w:iCs/>
+        </w:rPr>
+        <w:t>Society of Labor Economists, Annual Meetings, May</w:t>
+      </w:r>
+    </w:p>
+    <w:p>
+      <w:pPr>
+        <w:ind w:left="720"/>
+        <w:rPr>
+          <w:iCs/>
+        </w:rPr>
+      </w:pPr>
+      <w:r>
+        <w:rPr>
+          <w:iCs/>
+        </w:rPr>
+        <w:t>2021</w:t>
+      </w:r>
+    </w:p>
+    <w:p>
+      <w:pPr>
+        <w:ind w:left="720"/>
+        <w:rPr>
+          <w:iCs/>
+        </w:rPr>
+      </w:pPr>
+      <w:r>
+        <w:rPr>
+          <w:iCs/>
+        </w:rPr>
+        <w:t>Oberlin College, Department of Economics, December</w:t>
+      </w:r>
+    </w:p>
+    <w:p>
+      <w:pPr>
+        <w:ind w:left="720"/>
+        <w:rPr>
+          <w:i/>
+        </w:rPr>
+      </w:pPr>
+      <w:r>
+        <w:rPr>
+          <w:i/>
+        </w:rPr>
+        <w:t>2020</w:t>
+      </w:r>
+    </w:p>
+    <w:p>
+      <w:pPr>
+        <w:ind w:left="720"/>
+      </w:pPr>
+      <w:r>
+        <w:t xml:space="preserve">American Economic Association, Annual Meeting, January </w:t>
+      </w:r>
+    </w:p>
+    <w:p>
+      <w:pPr>
+        <w:ind w:left="720"/>
+        <w:rPr>
+          <w:i/>
+        </w:rPr>
+      </w:pPr>
+      <w:r>
+        <w:rPr>
+          <w:i/>
+        </w:rPr>
+        <w:t>2019</w:t>
+      </w:r>
+    </w:p>
+    <w:p>
+      <w:pPr>
+        <w:ind w:firstLine="720"/>
+      </w:pPr>
+      <w:r>
+        <w:t>Association of Policy Analysis and Management Fall Research Conference, November</w:t>
+      </w:r>
+    </w:p>
+    <w:p>
+      <w:pPr>
+        <w:ind w:left="720"/>
+        <w:rPr>
+          <w:iCs/>
+        </w:rPr>
+      </w:pPr>
+      <w:r>
+        <w:rPr>
+          <w:iCs/>
+        </w:rPr>
+        <w:t>Hamburg Center for Health Economics, Conference for Risky Health Behaviors, October</w:t>
+      </w:r>
+    </w:p>
+    <w:p>
+      <w:pPr>
+        <w:ind w:left="720"/>
+      </w:pPr>
+      <w:r>
+        <w:t>University of California Davis Alumni Conference, May</w:t>
+      </w:r>
+    </w:p>
+    <w:p>
+      <w:pPr>
+        <w:ind w:left="720"/>
+        <w:rPr>
+          <w:i/>
+        </w:rPr>
+      </w:pPr>
+      <w:r>
+        <w:rPr>
+          <w:i/>
+        </w:rPr>
+        <w:t>2018</w:t>
+      </w:r>
+    </w:p>
+    <w:p>
+      <w:pPr>
+        <w:ind w:left="720"/>
+      </w:pPr>
+      <w:r>
+        <w:t>University of West Virginia, Department of Economics, November</w:t>
+      </w:r>
+    </w:p>
+    <w:p>
+      <w:pPr>
+        <w:ind w:left="720"/>
+      </w:pPr>
+      <w:r>
+        <w:t xml:space="preserve">American </w:t>
+      </w:r>
+      <w:r>
+        <w:t>Society of Health Economics 2018</w:t>
+      </w:r>
+      <w:r>
+        <w:t xml:space="preserve"> meeting, June</w:t>
+      </w:r>
+    </w:p>
+    <w:p>
+      <w:pPr>
+        <w:ind w:left="720"/>
+      </w:pPr>
+      <w:r>
+        <w:t>University of California Davis Alumni Conference 2018, May</w:t>
+      </w:r>
+    </w:p>
+    <w:p>
+      <w:pPr>
+        <w:ind w:left="720"/>
+      </w:pPr>
+      <w:r>
+        <w:t>University of Connecticut, Department of Agricultural Economics, April</w:t>
+      </w:r>
+    </w:p>
+    <w:p>
+      <w:pPr>
+        <w:ind w:left="720"/>
+        <w:rPr>
+          <w:i/>
+        </w:rPr>
+      </w:pPr>
+      <w:r>
+        <w:rPr>
+          <w:i/>
+        </w:rPr>
+        <w:t>2017</w:t>
+      </w:r>
+    </w:p>
+    <w:p>
+      <w:pPr>
+        <w:ind w:left="720"/>
+      </w:pPr>
+      <w:r>
+        <w:t>Association of Policy Analysis and Management Fall Research Conference, November</w:t>
+      </w:r>
+    </w:p>
+    <w:p>
+      <w:pPr>
+        <w:ind w:left="720"/>
+      </w:pPr>
+      <w:r>
+        <w:t>University of New Hampshire, Economics Department seminar, October</w:t>
+      </w:r>
+    </w:p>
+    <w:p>
+      <w:pPr>
+        <w:ind w:left="720"/>
+      </w:pPr>
+      <w:r>
+        <w:t>University of Oregon, Economics Department seminar, October</w:t>
+      </w:r>
+    </w:p>
+    <w:p>
+      <w:pPr>
+        <w:ind w:left="720"/>
+      </w:pPr>
+      <w:r>
+        <w:rPr>
+          <w:bCs/>
+          <w:color w:val="212121"/>
+        </w:rPr>
+        <w:t>IZA Workshop on Welfare Consequences of Unemployment</w:t>
+      </w:r>
+      <w:r>
+        <w:rPr>
+          <w:bCs/>
+          <w:color w:val="212121"/>
+        </w:rPr>
+        <w:t>, March</w:t>
+      </w:r>
+      <w:r>
+        <w:rPr>
+          <w:bCs/>
+          <w:color w:val="212121"/>
+        </w:rPr>
+        <w:t> </w:t>
+      </w:r>
+    </w:p>
+    <w:p>
+      <w:pPr>
+        <w:ind w:left="720"/>
+        <w:rPr>
+          <w:i/>
+        </w:rPr>
+      </w:pPr>
+      <w:r>
+        <w:rPr>
+          <w:i/>
+        </w:rPr>
+        <w:t>2016</w:t>
+      </w:r>
+    </w:p>
+    <w:p>
+      <w:pPr>
+        <w:ind w:left="720"/>
+      </w:pPr>
+      <w:r>
+        <w:t>American Society of Health Economics 2016 meeting, June</w:t>
+      </w:r>
+    </w:p>
+    <w:p>
+      <w:pPr>
+        <w:ind w:left="720"/>
+      </w:pPr>
+      <w:r>
+        <w:t>Union College, Economics Department, April</w:t>
+      </w:r>
+    </w:p>
+    <w:p>
+      <w:pPr>
+        <w:ind w:left="720"/>
+      </w:pPr>
+      <w:r>
+        <w:t>Po</w:t>
+      </w:r>
+      <w:r>
+        <w:t>pulation Association of America</w:t>
+      </w:r>
+      <w:r>
+        <w:t xml:space="preserve"> 2016 annual Meeting, April</w:t>
+      </w:r>
+    </w:p>
+    <w:p>
+      <w:pPr>
+        <w:ind w:left="720"/>
+        <w:rPr>
+          <w:i/>
+        </w:rPr>
+      </w:pPr>
+      <w:r>
+        <w:rPr>
+          <w:i/>
+        </w:rPr>
+        <w:t xml:space="preserve">2015 </w:t>
+      </w:r>
+    </w:p>
+    <w:p>
+      <w:pPr>
+        <w:ind w:left="720"/>
+      </w:pPr>
+      <w:r>
+        <w:t xml:space="preserve">Southern Economic Association 2015 annual meeting, November </w:t>
+      </w:r>
+    </w:p>
+    <w:p>
+      <w:pPr>
+        <w:ind w:left="720"/>
+      </w:pPr>
+      <w:r>
+        <w:t>Lafayette College, Economics Department, November</w:t>
+      </w:r>
+    </w:p>
+    <w:p>
+      <w:pPr>
+        <w:ind w:left="720"/>
+      </w:pPr>
+      <w:r>
+        <w:t>International Health Economics Association annual meeting, July</w:t>
+      </w:r>
+    </w:p>
+    <w:p>
+      <w:pPr>
+        <w:ind w:left="720"/>
+      </w:pPr>
+      <w:r>
+        <w:t xml:space="preserve">Society of Labor Economics 2015 annual meeting, June </w:t>
+      </w:r>
+    </w:p>
+    <w:p>
+      <w:pPr>
+        <w:ind w:left="720"/>
+      </w:pPr>
+      <w:r>
+        <w:t>Montreal Family Economics Workshop</w:t>
+      </w:r>
+      <w:r>
+        <w:t xml:space="preserve"> 2015</w:t>
+      </w:r>
+      <w:r>
+        <w:t>, June</w:t>
+      </w:r>
+    </w:p>
+    <w:p>
+      <w:pPr>
+        <w:ind w:left="720"/>
+      </w:pPr>
+      <w:r>
+        <w:t xml:space="preserve">Cornell University, Department of </w:t>
+      </w:r>
+      <w:r>
+        <w:t>Policy Analysis and Management</w:t>
+      </w:r>
+      <w:r>
+        <w:rPr>
+          <w:b/>
+        </w:rPr>
+        <w:t xml:space="preserve">, </w:t>
+      </w:r>
+      <w:r>
+        <w:t>April</w:t>
+      </w:r>
+      <w:r>
+        <w:t>.</w:t>
+      </w:r>
+    </w:p>
+    <w:p>
+      <w:pPr>
+        <w:ind w:left="720"/>
+      </w:pPr>
+      <w:r>
+        <w:t>University of Massachusetts Lowell, Economics Department</w:t>
+      </w:r>
+      <w:r>
         <w:t>, April</w:t>
       </w:r>
       <w:r>
-        <w:rPr>
-          <w:iCs/>
-        </w:rPr>
         <w:t>.</w:t>
       </w:r>
     </w:p>
     <w:p>
       <w:pPr>
         <w:ind w:left="720"/>
-        <w:rPr>
-          <w:iCs/>
-        </w:rPr>
-      </w:pPr>
-      <w:r>
-        <w:rPr>
-          <w:iCs/>
-        </w:rPr>
-        <w:t>Atlanta Workshop on Public Policy and Child Wellbeing, March.</w:t>
-      </w:r>
-    </w:p>
-    <w:p>
-      <w:pPr>
-        <w:ind w:left="720"/>
-        <w:rPr>
-          <w:iCs/>
-        </w:rPr>
-      </w:pPr>
-      <w:r>
-        <w:rPr>
-          <w:iCs/>
-        </w:rPr>
-        <w:t>Atlanta Workshop on Public Policy and Child Wellbeing, March.</w:t>
-      </w:r>
-    </w:p>
-    <w:p>
-      <w:pPr>
-        <w:ind w:left="720"/>
-        <w:rPr>
-          <w:iCs/>
-        </w:rPr>
-      </w:pPr>
-      <w:r>
-        <w:rPr>
-          <w:iCs/>
-        </w:rPr>
-        <w:t xml:space="preserve">University of Massachusetts Amherst, Department of </w:t>
-      </w:r>
-      <w:r>
-        <w:rPr>
-          <w:iCs/>
-        </w:rPr>
-        <w:t xml:space="preserve">Resource </w:t>
-      </w:r>
-      <w:r>
-        <w:rPr>
-          <w:iCs/>
-        </w:rPr>
-        <w:t xml:space="preserve">Economics, </w:t>
-      </w:r>
-      <w:r>
-        <w:rPr>
-          <w:iCs/>
-        </w:rPr>
-        <w:t>March.</w:t>
-      </w:r>
-    </w:p>
-    <w:p>
-      <w:pPr>
-        <w:ind w:left="720"/>
-        <w:rPr>
-          <w:iCs/>
-        </w:rPr>
-      </w:pPr>
-      <w:r>
-        <w:rPr>
-          <w:iCs/>
-        </w:rPr>
-        <w:t>2023</w:t>
-      </w:r>
-    </w:p>
-    <w:p>
-      <w:pPr>
-        <w:ind w:left="720"/>
-        <w:rPr>
-          <w:iCs/>
-        </w:rPr>
-      </w:pPr>
-      <w:r>
-        <w:rPr>
-          <w:iCs/>
-        </w:rPr>
-        <w:t xml:space="preserve">University of Pittsburgh, Department of Economics, </w:t>
-      </w:r>
-      <w:r>
-        <w:rPr>
-          <w:iCs/>
-        </w:rPr>
-        <w:t>Department of Economics, October</w:t>
-      </w:r>
-    </w:p>
-    <w:p>
-      <w:pPr>
-        <w:ind w:left="720"/>
-        <w:rPr>
-          <w:iCs/>
-        </w:rPr>
-      </w:pPr>
-      <w:r>
-        <w:rPr>
-          <w:iCs/>
-        </w:rPr>
-        <w:t>Atlanta Workshop on Public Policy and Child Wellbeing, March.</w:t>
-      </w:r>
-    </w:p>
-    <w:p>
-      <w:pPr>
-        <w:ind w:left="720"/>
-        <w:rPr>
-          <w:iCs/>
-        </w:rPr>
-      </w:pPr>
-      <w:r>
-        <w:rPr>
-          <w:iCs/>
-        </w:rPr>
-        <w:t>Eastern Economic Association, Annual Meeting, February.</w:t>
-      </w:r>
-    </w:p>
-    <w:p>
-      <w:pPr>
-        <w:ind w:left="720"/>
-        <w:rPr>
-          <w:i/>
-        </w:rPr>
-      </w:pPr>
-      <w:r>
-        <w:rPr>
-          <w:i/>
-        </w:rPr>
-        <w:t>2022</w:t>
-      </w:r>
-    </w:p>
-    <w:p>
-      <w:pPr>
-        <w:ind w:left="720"/>
-        <w:rPr>
-          <w:iCs/>
-        </w:rPr>
-      </w:pPr>
-      <w:r>
-        <w:rPr>
-          <w:iCs/>
-        </w:rPr>
-        <w:t>NBER SI Children’s Meeting, presenting: “Time in Foster Care, Incentives to Adopt, and Child Outcomes.”, July</w:t>
-      </w:r>
-    </w:p>
-    <w:p>
-      <w:pPr>
-        <w:ind w:left="720"/>
-        <w:rPr>
-          <w:iCs/>
-        </w:rPr>
-      </w:pPr>
-      <w:r>
-        <w:rPr>
-          <w:iCs/>
-        </w:rPr>
-        <w:t>Society of Labor Economists, Annual Meetings, May</w:t>
-      </w:r>
-    </w:p>
-    <w:p>
-      <w:pPr>
-        <w:ind w:left="720"/>
-        <w:rPr>
-          <w:iCs/>
-        </w:rPr>
-      </w:pPr>
-      <w:r>
-        <w:rPr>
-          <w:iCs/>
-        </w:rPr>
-        <w:t>2021</w:t>
-      </w:r>
-    </w:p>
-    <w:p>
-      <w:pPr>
-        <w:ind w:left="720"/>
-        <w:rPr>
-          <w:iCs/>
-        </w:rPr>
-      </w:pPr>
-      <w:r>
-        <w:rPr>
-          <w:iCs/>
-        </w:rPr>
-        <w:t>Oberlin College, Department of Economics, December</w:t>
-      </w:r>
-    </w:p>
-    <w:p>
-      <w:pPr>
-        <w:ind w:left="720"/>
-        <w:rPr>
-          <w:i/>
-        </w:rPr>
-      </w:pPr>
-      <w:r>
-        <w:rPr>
-          <w:i/>
-        </w:rPr>
-        <w:t>2020</w:t>
-      </w:r>
-    </w:p>
-    <w:p>
-      <w:pPr>
-        <w:ind w:left="720"/>
-      </w:pPr>
-      <w:r>
-        <w:t xml:space="preserve">American Economic Association, Annual Meeting, January </w:t>
-      </w:r>
-    </w:p>
-    <w:p>
-      <w:pPr>
-        <w:ind w:left="720"/>
-        <w:rPr>
-          <w:i/>
-        </w:rPr>
-      </w:pPr>
-      <w:r>
-        <w:rPr>
-          <w:i/>
-        </w:rPr>
-        <w:t>2019</w:t>
-      </w:r>
-    </w:p>
-    <w:p>
-      <w:pPr>
-        <w:ind w:firstLine="720"/>
-      </w:pPr>
-      <w:r>
-        <w:t>Association of Policy Analysis and Management Fall Research Conference, November</w:t>
-      </w:r>
-    </w:p>
-    <w:p>
-      <w:pPr>
-        <w:ind w:left="720"/>
-        <w:rPr>
-          <w:iCs/>
-        </w:rPr>
-      </w:pPr>
-      <w:r>
-        <w:rPr>
-          <w:iCs/>
-        </w:rPr>
-        <w:t>Hamburg Center for Health Economics, Conference for Risky Health Behaviors, October</w:t>
-      </w:r>
-    </w:p>
-    <w:p>
-      <w:pPr>
-        <w:ind w:left="720"/>
-      </w:pPr>
-      <w:r>
-        <w:t>University of California Davis Alumni Conference, May</w:t>
-      </w:r>
-    </w:p>
-    <w:p>
-      <w:pPr>
-        <w:ind w:left="720"/>
-        <w:rPr>
-          <w:i/>
-        </w:rPr>
-      </w:pPr>
-      <w:r>
-        <w:rPr>
-          <w:i/>
-        </w:rPr>
-        <w:t>2018</w:t>
-      </w:r>
-    </w:p>
-    <w:p>
-      <w:pPr>
-        <w:ind w:left="720"/>
-      </w:pPr>
-      <w:r>
-        <w:t>University of West Virginia, Department of Economics, November</w:t>
-      </w:r>
-    </w:p>
-    <w:p>
-      <w:pPr>
-        <w:ind w:left="720"/>
-      </w:pPr>
-      <w:r>
-        <w:t xml:space="preserve">American </w:t>
-      </w:r>
-      <w:r>
-        <w:t>Society of Health Economics 2018</w:t>
-      </w:r>
-      <w:r>
-        <w:t xml:space="preserve"> meeting, June</w:t>
-      </w:r>
-    </w:p>
-    <w:p>
-      <w:pPr>
-        <w:ind w:left="720"/>
-      </w:pPr>
-      <w:r>
-        <w:t>University of California Davis Alumni Conference 2018, May</w:t>
-      </w:r>
-    </w:p>
-    <w:p>
-      <w:pPr>
-        <w:ind w:left="720"/>
-      </w:pPr>
-      <w:r>
-        <w:t>University of Connecticut, Department of Agricultural Economics, April</w:t>
-      </w:r>
-    </w:p>
-    <w:p>
-      <w:pPr>
-        <w:ind w:left="720"/>
-        <w:rPr>
-          <w:i/>
-        </w:rPr>
-      </w:pPr>
-      <w:r>
-        <w:rPr>
-          <w:i/>
-        </w:rPr>
-        <w:t>2017</w:t>
-      </w:r>
-    </w:p>
-    <w:p>
-      <w:pPr>
-        <w:ind w:left="720"/>
-      </w:pPr>
-      <w:r>
-        <w:t>Association of Policy Analysis and Management Fall Research Conference, November</w:t>
-      </w:r>
-    </w:p>
-    <w:p>
-      <w:pPr>
-        <w:ind w:left="720"/>
-      </w:pPr>
-      <w:r>
-        <w:t>University of New Hampshire, Economics Department seminar, October</w:t>
-      </w:r>
-    </w:p>
-    <w:p>
-      <w:pPr>
-        <w:ind w:left="720"/>
-      </w:pPr>
-      <w:r>
-        <w:t>University of Oregon, Economics Department seminar, October</w:t>
-      </w:r>
-    </w:p>
-    <w:p>
-      <w:pPr>
-        <w:ind w:left="720"/>
-      </w:pPr>
-      <w:r>
-        <w:rPr>
-          <w:bCs/>
-          <w:color w:val="212121"/>
-        </w:rPr>
-        <w:t>IZA Workshop on Welfare Consequences of Unemployment</w:t>
-      </w:r>
-      <w:r>
-        <w:rPr>
-          <w:bCs/>
-          <w:color w:val="212121"/>
-        </w:rPr>
-        <w:t>, March</w:t>
-      </w:r>
-      <w:r>
-        <w:rPr>
-          <w:bCs/>
-          <w:color w:val="212121"/>
-        </w:rPr>
-        <w:t> </w:t>
-      </w:r>
-    </w:p>
-    <w:p>
-      <w:pPr>
-        <w:ind w:left="720"/>
-        <w:rPr>
-          <w:i/>
-        </w:rPr>
-      </w:pPr>
-      <w:r>
-        <w:rPr>
-          <w:i/>
-        </w:rPr>
-        <w:t>2016</w:t>
-      </w:r>
-    </w:p>
-    <w:p>
-      <w:pPr>
-        <w:ind w:left="720"/>
-      </w:pPr>
-      <w:r>
-        <w:t>American Society of Health Economics 2016 meeting, June</w:t>
-      </w:r>
-    </w:p>
-    <w:p>
-      <w:pPr>
-        <w:ind w:left="720"/>
-      </w:pPr>
-      <w:r>
-        <w:t>Union College, Economics Department, April</w:t>
-      </w:r>
-    </w:p>
-    <w:p>
-      <w:pPr>
-        <w:ind w:left="720"/>
-      </w:pPr>
-      <w:r>
-        <w:t>Po</w:t>
-      </w:r>
-      <w:r>
-        <w:t>pulation Association of America</w:t>
-      </w:r>
-      <w:r>
-        <w:t xml:space="preserve"> 2016 annual Meeting, April</w:t>
-      </w:r>
-    </w:p>
-    <w:p>
-      <w:pPr>
-        <w:ind w:left="720"/>
-        <w:rPr>
-          <w:i/>
-        </w:rPr>
-      </w:pPr>
-      <w:r>
-        <w:rPr>
-          <w:i/>
-        </w:rPr>
-        <w:t xml:space="preserve">2015 </w:t>
-      </w:r>
-    </w:p>
-    <w:p>
-      <w:pPr>
-        <w:ind w:left="720"/>
-      </w:pPr>
-      <w:r>
-        <w:t xml:space="preserve">Southern Economic Association 2015 annual meeting, November </w:t>
-      </w:r>
-    </w:p>
-    <w:p>
-      <w:pPr>
-        <w:ind w:left="720"/>
-      </w:pPr>
-      <w:r>
-        <w:t>Lafayette College, Economics Department, November</w:t>
-      </w:r>
-    </w:p>
-    <w:p>
-      <w:pPr>
-        <w:ind w:left="720"/>
-      </w:pPr>
-      <w:r>
-        <w:lastRenderedPageBreak/>
-        <w:t>International Health Economics Association annual meeting, July</w:t>
-      </w:r>
-    </w:p>
-    <w:p>
-      <w:pPr>
-        <w:ind w:left="720"/>
-      </w:pPr>
-      <w:r>
-        <w:t xml:space="preserve">Society of Labor Economics 2015 annual meeting, June </w:t>
-      </w:r>
-    </w:p>
-    <w:p>
-      <w:pPr>
-        <w:ind w:left="720"/>
-      </w:pPr>
-      <w:r>
-        <w:t>Montreal Family Economics Workshop</w:t>
-      </w:r>
-      <w:r>
-        <w:t xml:space="preserve"> 2015</w:t>
-      </w:r>
-      <w:r>
-        <w:t>, June</w:t>
-      </w:r>
-    </w:p>
-    <w:p>
-      <w:pPr>
-        <w:ind w:left="720"/>
-      </w:pPr>
-      <w:r>
-        <w:t xml:space="preserve">Cornell University, Department of </w:t>
-      </w:r>
-      <w:r>
-        <w:t>Policy Analysis and Management</w:t>
-      </w:r>
-      <w:r>
+      </w:pPr>
+      <w:r>
+        <w:t xml:space="preserve">Yale University, Yale Health Day, </w:t>
+      </w:r>
+      <w:r>
+        <w:t>February.</w:t>
+      </w:r>
+    </w:p>
+    <w:p>
+      <w:pPr>
+        <w:ind w:left="720"/>
+        <w:rPr>
+          <w:i/>
+        </w:rPr>
+      </w:pPr>
+      <w:r>
+        <w:rPr>
+          <w:i/>
+        </w:rPr>
+        <w:t>2014</w:t>
+      </w:r>
+    </w:p>
+    <w:p>
+      <w:pPr>
+        <w:ind w:left="720"/>
+      </w:pPr>
+      <w:r>
+        <w:t>University of Albany, Eco</w:t>
+      </w:r>
+      <w:r>
+        <w:t>nomics Department, December</w:t>
+      </w:r>
+      <w:r>
+        <w:t>.</w:t>
+      </w:r>
+      <w:r>
+        <w:t xml:space="preserve"> </w:t>
+      </w:r>
+    </w:p>
+    <w:p>
+      <w:pPr>
+        <w:ind w:left="720"/>
+      </w:pPr>
+      <w:r>
+        <w:t>University of California Riverside, Eco</w:t>
+      </w:r>
+      <w:r>
+        <w:t>nomics Department, November</w:t>
+      </w:r>
+      <w:r>
+        <w:t>.</w:t>
+      </w:r>
+      <w:r>
+        <w:t xml:space="preserve"> </w:t>
+      </w:r>
+    </w:p>
+    <w:p>
+      <w:pPr>
+        <w:ind w:left="720"/>
+      </w:pPr>
+      <w:r>
+        <w:t xml:space="preserve">Clark University, </w:t>
+      </w:r>
+      <w:r>
+        <w:t>Economics Dep</w:t>
+      </w:r>
+      <w:r>
+        <w:t>artment, October</w:t>
+      </w:r>
+      <w:r>
+        <w:t>.</w:t>
+      </w:r>
+      <w:r>
+        <w:t xml:space="preserve"> </w:t>
+      </w:r>
+    </w:p>
+    <w:p>
+      <w:pPr>
+        <w:ind w:left="720"/>
+      </w:pPr>
+      <w:r>
+        <w:t>6</w:t>
+      </w:r>
+      <w:r>
+        <w:rPr>
+          <w:vertAlign w:val="superscript"/>
+        </w:rPr>
+        <w:t>th</w:t>
+      </w:r>
+      <w:r>
+        <w:t xml:space="preserve"> Annual Meeting on the Economics of Risky Behaviors, IZA conference, May</w:t>
+      </w:r>
+      <w:r>
+        <w:t>.</w:t>
+      </w:r>
+      <w:r>
+        <w:t xml:space="preserve"> </w:t>
+      </w:r>
+    </w:p>
+    <w:p>
+      <w:pPr>
+        <w:ind w:left="720"/>
+      </w:pPr>
+      <w:r>
+        <w:t>American Economic Association, Annual Me</w:t>
+      </w:r>
+      <w:r>
+        <w:t xml:space="preserve">eting, Discussant, </w:t>
+      </w:r>
+      <w:r>
+        <w:t>January.</w:t>
+      </w:r>
+      <w:r>
+        <w:t xml:space="preserve"> </w:t>
+      </w:r>
+    </w:p>
+    <w:p>
+      <w:pPr>
+        <w:ind w:left="720"/>
+        <w:rPr>
+          <w:i/>
+        </w:rPr>
+      </w:pPr>
+      <w:r>
+        <w:rPr>
+          <w:i/>
+        </w:rPr>
+        <w:t>2013</w:t>
+      </w:r>
+    </w:p>
+    <w:p>
+      <w:pPr>
+        <w:ind w:left="720"/>
+      </w:pPr>
+      <w:r>
+        <w:t xml:space="preserve">Yale University, Yale Health Day, December </w:t>
+      </w:r>
+    </w:p>
+    <w:p>
+      <w:pPr>
+        <w:ind w:left="720"/>
+      </w:pPr>
+      <w:r>
+        <w:t xml:space="preserve">Virginia Commonwealth University, </w:t>
+      </w:r>
+      <w:r>
+        <w:t xml:space="preserve">Department of Economics, December </w:t>
+      </w:r>
+    </w:p>
+    <w:p>
+      <w:pPr>
+        <w:ind w:left="720"/>
+      </w:pPr>
+      <w:r>
+        <w:t>American Economic Association</w:t>
+      </w:r>
+      <w:r>
+        <w:t xml:space="preserve">, Annual Meeting, </w:t>
+      </w:r>
+      <w:r>
+        <w:t>January</w:t>
+      </w:r>
+      <w:r>
+        <w:t xml:space="preserve"> </w:t>
+      </w:r>
+    </w:p>
+    <w:p>
+      <w:pPr>
+        <w:ind w:left="720"/>
+        <w:rPr>
+          <w:i/>
+        </w:rPr>
+      </w:pPr>
+      <w:r>
+        <w:rPr>
+          <w:i/>
+        </w:rPr>
+        <w:t>2012</w:t>
+      </w:r>
+    </w:p>
+    <w:p>
+      <w:pPr>
+        <w:ind w:left="720"/>
         <w:rPr>
           <w:b/>
         </w:rPr>
+      </w:pPr>
+      <w:r>
+        <w:t xml:space="preserve">All California Labor Economics Conference, poster session, September </w:t>
+      </w:r>
+    </w:p>
+    <w:p>
+      <w:pPr>
+        <w:ind w:left="720"/>
+      </w:pPr>
+      <w:r>
+        <w:t>University of North Carolina</w:t>
+      </w:r>
+      <w:r>
+        <w:t>,</w:t>
+      </w:r>
+      <w:r>
+        <w:t xml:space="preserve"> Greensboro,</w:t>
+      </w:r>
+      <w:r>
+        <w:t xml:space="preserve"> Department of Economics,</w:t>
+      </w:r>
+      <w:r>
+        <w:t xml:space="preserve"> March </w:t>
+      </w:r>
+    </w:p>
+    <w:p>
+      <w:pPr>
+        <w:ind w:left="720"/>
+      </w:pPr>
+      <w:r>
+        <w:t xml:space="preserve">Bilinski Fellowship Research Showcase, </w:t>
+      </w:r>
+      <w:r>
+        <w:t xml:space="preserve">University of California Davis, </w:t>
+      </w:r>
+      <w:r>
+        <w:t xml:space="preserve">May </w:t>
+      </w:r>
+    </w:p>
+    <w:p>
+      <w:pPr>
+        <w:ind w:left="720"/>
+        <w:rPr>
+          <w:i/>
+        </w:rPr>
+      </w:pPr>
+      <w:r>
+        <w:rPr>
+          <w:i/>
+        </w:rPr>
+        <w:t>2011</w:t>
+      </w:r>
+    </w:p>
+    <w:p>
+      <w:pPr>
+        <w:ind w:left="720"/>
+      </w:pPr>
+      <w:r>
+        <w:t xml:space="preserve">NBER Summer Institute, July </w:t>
+      </w:r>
+    </w:p>
+    <w:p/>
+    <w:p>
+      <w:pPr>
+        <w:rPr>
+          <w:b/>
+        </w:rPr>
+      </w:pPr>
+      <w:r>
+        <w:rPr>
+          <w:b/>
+        </w:rPr>
+        <w:t>Graduate Students</w:t>
+      </w:r>
+      <w:r>
+        <w:rPr>
+          <w:b/>
+        </w:rPr>
+        <w:t>:</w:t>
+      </w:r>
+      <w:r>
+        <w:rPr>
+          <w:b/>
+        </w:rPr>
+        <w:t xml:space="preserve"> Advised</w:t>
+      </w:r>
+      <w:r>
+        <w:rPr>
+          <w:b/>
+        </w:rPr>
         <w:t xml:space="preserve">, </w:t>
       </w:r>
       <w:r>
-        <w:t>April</w:t>
-      </w:r>
-      <w:r>
-        <w:t>.</w:t>
-      </w:r>
-    </w:p>
-    <w:p>
-      <w:pPr>
-        <w:ind w:left="720"/>
-      </w:pPr>
-      <w:r>
-        <w:t>University of Massachusetts Lowell, Economics Department</w:t>
-      </w:r>
-      <w:r>
-        <w:t>, April</w:t>
-      </w:r>
-      <w:r>
-        <w:t>.</w:t>
-      </w:r>
-    </w:p>
-    <w:p>
-      <w:pPr>
-        <w:ind w:left="720"/>
-      </w:pPr>
-      <w:r>
-        <w:t xml:space="preserve">Yale University, Yale Health Day, </w:t>
-      </w:r>
-      <w:r>
-        <w:t>February.</w:t>
-      </w:r>
-    </w:p>
-    <w:p>
-      <w:pPr>
-        <w:ind w:left="720"/>
-        <w:rPr>
-          <w:i/>
-        </w:rPr>
-      </w:pPr>
-      <w:r>
-        <w:rPr>
-          <w:i/>
-        </w:rPr>
-        <w:t>2014</w:t>
-      </w:r>
-    </w:p>
-    <w:p>
-      <w:pPr>
-        <w:ind w:left="720"/>
-      </w:pPr>
-      <w:r>
-        <w:t>University of Albany, Eco</w:t>
-      </w:r>
-      <w:r>
-        <w:t>nomics Department, December</w:t>
-      </w:r>
-      <w:r>
-        <w:t>.</w:t>
-      </w:r>
-      <w:r>
+        <w:rPr>
+          <w:b/>
+        </w:rPr>
+        <w:t>Role,</w:t>
+      </w:r>
+      <w:r>
+        <w:rPr>
+          <w:b/>
+        </w:rPr>
         <w:t xml:space="preserve"> </w:t>
       </w:r>
-    </w:p>
-    <w:p>
-      <w:pPr>
-        <w:ind w:left="720"/>
-      </w:pPr>
-      <w:r>
-        <w:t>University of California Riverside, Eco</w:t>
-      </w:r>
-      <w:r>
-        <w:t>nomics Department, November</w:t>
-      </w:r>
-      <w:r>
-        <w:t>.</w:t>
-      </w:r>
-      <w:r>
+      <w:r>
+        <w:rPr>
+          <w:b/>
+        </w:rPr>
+        <w:t>Date of Degree</w:t>
+      </w:r>
+      <w:r>
+        <w:rPr>
+          <w:b/>
+        </w:rPr>
+        <w:t>,</w:t>
+      </w:r>
+      <w:r>
+        <w:rPr>
+          <w:b/>
+        </w:rPr>
         <w:t xml:space="preserve"> </w:t>
       </w:r>
-    </w:p>
-    <w:p>
-      <w:pPr>
-        <w:ind w:left="720"/>
-      </w:pPr>
-      <w:r>
-        <w:t xml:space="preserve">Clark University, </w:t>
-      </w:r>
-      <w:r>
-        <w:t>Economics Dep</w:t>
-      </w:r>
-      <w:r>
-        <w:t>artment, October</w:t>
-      </w:r>
-      <w:r>
-        <w:t>.</w:t>
-      </w:r>
-      <w:r>
-        <w:t xml:space="preserve"> </w:t>
-      </w:r>
-    </w:p>
-    <w:p>
-      <w:pPr>
-        <w:ind w:left="720"/>
-      </w:pPr>
-      <w:r>
-        <w:t>6</w:t>
-      </w:r>
-      <w:r>
-        <w:rPr>
-          <w:vertAlign w:val="superscript"/>
-        </w:rPr>
-        <w:t>th</w:t>
-      </w:r>
-      <w:r>
-        <w:t xml:space="preserve"> Annual Meeting on the Economics of Risky Behaviors, IZA conference, May</w:t>
-      </w:r>
-      <w:r>
-        <w:t>.</w:t>
-      </w:r>
-      <w:r>
-        <w:t xml:space="preserve"> </w:t>
-      </w:r>
-    </w:p>
-    <w:p>
-      <w:pPr>
-        <w:ind w:left="720"/>
-      </w:pPr>
-      <w:r>
-        <w:t>American Economic Association, Annual Me</w:t>
-      </w:r>
-      <w:r>
-        <w:t xml:space="preserve">eting, Discussant, </w:t>
-      </w:r>
-      <w:r>
-        <w:t>January.</w:t>
-      </w:r>
-      <w:r>
-        <w:t xml:space="preserve"> </w:t>
-      </w:r>
-    </w:p>
-    <w:p>
-      <w:pPr>
-        <w:ind w:left="720"/>
-        <w:rPr>
-          <w:i/>
-        </w:rPr>
-      </w:pPr>
-      <w:r>
-        <w:rPr>
-          <w:i/>
-        </w:rPr>
-        <w:t>2013</w:t>
-      </w:r>
-    </w:p>
-    <w:p>
-      <w:pPr>
-        <w:ind w:left="720"/>
-      </w:pPr>
-      <w:r>
-        <w:t xml:space="preserve">Yale University, Yale Health Day, December </w:t>
-      </w:r>
-    </w:p>
-    <w:p>
-      <w:pPr>
-        <w:ind w:left="720"/>
-      </w:pPr>
-      <w:r>
-        <w:t xml:space="preserve">Virginia Commonwealth University, </w:t>
-      </w:r>
-      <w:r>
-        <w:t xml:space="preserve">Department of Economics, December </w:t>
-      </w:r>
-    </w:p>
-    <w:p>
-      <w:pPr>
-        <w:ind w:left="720"/>
-      </w:pPr>
-      <w:r>
-        <w:t>American Economic Association</w:t>
-      </w:r>
-      <w:r>
-        <w:t xml:space="preserve">, Annual Meeting, </w:t>
-      </w:r>
-      <w:r>
-        <w:t>January</w:t>
-      </w:r>
-      <w:r>
-        <w:t xml:space="preserve"> </w:t>
-      </w:r>
-    </w:p>
-    <w:p>
-      <w:pPr>
-        <w:ind w:left="720"/>
-        <w:rPr>
-          <w:i/>
-        </w:rPr>
-      </w:pPr>
-      <w:r>
-        <w:rPr>
-          <w:i/>
-        </w:rPr>
-        <w:t>2012</w:t>
-      </w:r>
-    </w:p>
-    <w:p>
-      <w:pPr>
-        <w:ind w:left="720"/>
+      <w:r>
         <w:rPr>
           <w:b/>
         </w:rPr>
-      </w:pPr>
-      <w:r>
-        <w:t xml:space="preserve">All California Labor Economics Conference, poster session, September </w:t>
-      </w:r>
-    </w:p>
-    <w:p>
-      <w:pPr>
-        <w:ind w:left="720"/>
-      </w:pPr>
-      <w:r>
-        <w:t>University of North Carolina</w:t>
-      </w:r>
-      <w:r>
-        <w:t>,</w:t>
-      </w:r>
-      <w:r>
-        <w:t xml:space="preserve"> Greensboro,</w:t>
-      </w:r>
-      <w:r>
-        <w:t xml:space="preserve"> Department of Economics,</w:t>
-      </w:r>
-      <w:r>
-        <w:t xml:space="preserve"> March </w:t>
-      </w:r>
-    </w:p>
-    <w:p>
-      <w:pPr>
-        <w:ind w:left="720"/>
-      </w:pPr>
-      <w:r>
-        <w:t xml:space="preserve">Bilinski Fellowship Research Showcase, </w:t>
-      </w:r>
-      <w:r>
-        <w:t xml:space="preserve">University of California Davis, </w:t>
-      </w:r>
-      <w:r>
-        <w:t xml:space="preserve">May </w:t>
-      </w:r>
-    </w:p>
-    <w:p>
-      <w:pPr>
-        <w:ind w:left="720"/>
-        <w:rPr>
-          <w:i/>
-        </w:rPr>
-      </w:pPr>
-      <w:r>
-        <w:rPr>
-          <w:i/>
-        </w:rPr>
-        <w:t>2011</w:t>
-      </w:r>
-    </w:p>
-    <w:p>
-      <w:pPr>
-        <w:ind w:left="720"/>
-      </w:pPr>
-      <w:r>
-        <w:t xml:space="preserve">NBER Summer Institute, July </w:t>
-      </w:r>
-    </w:p>
-    <w:p/>
-    <w:p>
-      <w:pPr>
-        <w:rPr>
-          <w:b/>
-        </w:rPr>
-      </w:pPr>
-      <w:r>
-        <w:rPr>
-          <w:b/>
-        </w:rPr>
-        <w:t>Graduate Students</w:t>
-      </w:r>
-      <w:r>
-        <w:rPr>
-          <w:b/>
-        </w:rPr>
-        <w:t>:</w:t>
-      </w:r>
-      <w:r>
-        <w:rPr>
-          <w:b/>
-        </w:rPr>
-        <w:t xml:space="preserve"> Advised</w:t>
-      </w:r>
-      <w:r>
-        <w:rPr>
-          <w:b/>
-        </w:rPr>
-        <w:t xml:space="preserve">, </w:t>
-      </w:r>
-      <w:r>
-        <w:rPr>
-          <w:b/>
-        </w:rPr>
-        <w:t>Role,</w:t>
-      </w:r>
-      <w:r>
-        <w:rPr>
-          <w:b/>
-        </w:rPr>
-        <w:t xml:space="preserve"> </w:t>
-      </w:r>
-      <w:r>
-        <w:rPr>
-          <w:b/>
-        </w:rPr>
-        <w:t>Date of Degree</w:t>
-      </w:r>
-      <w:r>
-        <w:rPr>
-          <w:b/>
-        </w:rPr>
-        <w:t>,</w:t>
-      </w:r>
-      <w:r>
-        <w:rPr>
-          <w:b/>
-        </w:rPr>
-        <w:t xml:space="preserve"> </w:t>
-      </w:r>
-      <w:proofErr w:type="gramStart"/>
-      <w:r>
-        <w:rPr>
-          <w:b/>
-        </w:rPr>
-        <w:t>First</w:t>
-      </w:r>
-      <w:proofErr w:type="gramEnd"/>
-      <w:r>
-        <w:rPr>
-          <w:b/>
-        </w:rPr>
-        <w:t xml:space="preserve"> permanent Job</w:t>
+        <w:t>First permanent Job</w:t>
       </w:r>
       <w:r>
         <w:rPr>
@@ -5650,21 +5492,12 @@
           <w:color w:val="000000" w:themeColor="text1"/>
         </w:rPr>
       </w:pPr>
-      <w:proofErr w:type="spellStart"/>
-      <w:r>
-        <w:rPr>
-          <w:bCs/>
-          <w:color w:val="000000" w:themeColor="text1"/>
-        </w:rPr>
-        <w:t>Sirui</w:t>
-      </w:r>
-      <w:proofErr w:type="spellEnd"/>
-      <w:r>
-        <w:rPr>
-          <w:bCs/>
-          <w:color w:val="000000" w:themeColor="text1"/>
-        </w:rPr>
-        <w:t xml:space="preserve"> Qiu, Dissertation Chair, dissertation in progress</w:t>
+      <w:r>
+        <w:rPr>
+          <w:bCs/>
+          <w:color w:val="000000" w:themeColor="text1"/>
+        </w:rPr>
+        <w:t>Sirui Qiu, Dissertation Chair, dissertation in progress</w:t>
       </w:r>
     </w:p>
     <w:p>
@@ -6215,7 +6048,6 @@
         <w:rPr>
           <w:color w:val="000000" w:themeColor="text1"/>
         </w:rPr>
-        <w:lastRenderedPageBreak/>
         <w:t>Tao Song, Committee member, May 201</w:t>
       </w:r>
       <w:r>
@@ -6262,21 +6094,12 @@
           <w:shd w:val="clear" w:color="auto" w:fill="FFFFFF"/>
         </w:rPr>
       </w:pPr>
-      <w:proofErr w:type="spellStart"/>
-      <w:r>
-        <w:rPr>
-          <w:color w:val="000000" w:themeColor="text1"/>
-          <w:shd w:val="clear" w:color="auto" w:fill="FFFFFF"/>
-        </w:rPr>
-        <w:t>Peijingran</w:t>
-      </w:r>
-      <w:proofErr w:type="spellEnd"/>
-      <w:r>
-        <w:rPr>
-          <w:color w:val="000000" w:themeColor="text1"/>
-          <w:shd w:val="clear" w:color="auto" w:fill="FFFFFF"/>
-        </w:rPr>
-        <w:t xml:space="preserve"> Yu, </w:t>
+      <w:r>
+        <w:rPr>
+          <w:color w:val="000000" w:themeColor="text1"/>
+          <w:shd w:val="clear" w:color="auto" w:fill="FFFFFF"/>
+        </w:rPr>
+        <w:t xml:space="preserve">Peijingran Yu, </w:t>
       </w:r>
       <w:r>
         <w:rPr>
@@ -8623,20 +8446,16 @@
 </file>
 
 <file path=customXml/item1.xml><?xml version="1.0" encoding="utf-8"?>
-<p:properties xmlns:p="http://schemas.microsoft.com/office/2006/metadata/properties" xmlns:xsi="http://www.w3.org/2001/XMLSchema-instance" xmlns:pc="http://schemas.microsoft.com/office/infopath/2007/PartnerControls">
-  <documentManagement>
-    <_activity xmlns="a70d8763-7c41-4a73-b44e-b9180792dbd4" xsi:nil="true"/>
-  </documentManagement>
-</p:properties>
-</file>
-
-<file path=customXml/item2.xml><?xml version="1.0" encoding="utf-8"?>
 <?mso-contentType ?>
 <FormTemplates xmlns="http://schemas.microsoft.com/sharepoint/v3/contenttype/forms">
   <Display>DocumentLibraryForm</Display>
   <Edit>DocumentLibraryForm</Edit>
   <New>DocumentLibraryForm</New>
 </FormTemplates>
+</file>
+
+<file path=customXml/item2.xml><?xml version="1.0" encoding="utf-8"?>
+<b:Sources xmlns:b="http://schemas.openxmlformats.org/officeDocument/2006/bibliography" xmlns="http://schemas.openxmlformats.org/officeDocument/2006/bibliography" SelectedStyle="\APA.XSL" StyleName="APA"/>
 </file>
 
 <file path=customXml/item3.xml><?xml version="1.0" encoding="utf-8"?>
@@ -8875,23 +8694,25 @@
 </file>
 
 <file path=customXml/item4.xml><?xml version="1.0" encoding="utf-8"?>
-<b:Sources xmlns:b="http://schemas.openxmlformats.org/officeDocument/2006/bibliography" xmlns="http://schemas.openxmlformats.org/officeDocument/2006/bibliography" SelectedStyle="\APA.XSL" StyleName="APA"/>
+<p:properties xmlns:p="http://schemas.microsoft.com/office/2006/metadata/properties" xmlns:xsi="http://www.w3.org/2001/XMLSchema-instance" xmlns:pc="http://schemas.microsoft.com/office/infopath/2007/PartnerControls">
+  <documentManagement>
+    <_activity xmlns="a70d8763-7c41-4a73-b44e-b9180792dbd4" xsi:nil="true"/>
+  </documentManagement>
+</p:properties>
 </file>
 
 <file path=customXml/itemProps1.xml><?xml version="1.0" encoding="utf-8"?>
-<ds:datastoreItem xmlns:ds="http://schemas.openxmlformats.org/officeDocument/2006/customXml" ds:itemID="{BCBBEC62-780F-47CE-A858-C556351822F4}">
+<ds:datastoreItem xmlns:ds="http://schemas.openxmlformats.org/officeDocument/2006/customXml" ds:itemID="{DFE2807C-7CBC-4D53-A3DD-7AE62A49A810}">
   <ds:schemaRefs>
-    <ds:schemaRef ds:uri="http://schemas.microsoft.com/office/2006/metadata/properties"/>
-    <ds:schemaRef ds:uri="http://schemas.microsoft.com/office/infopath/2007/PartnerControls"/>
-    <ds:schemaRef ds:uri="a70d8763-7c41-4a73-b44e-b9180792dbd4"/>
+    <ds:schemaRef ds:uri="http://schemas.microsoft.com/sharepoint/v3/contenttype/forms"/>
   </ds:schemaRefs>
 </ds:datastoreItem>
 </file>
 
 <file path=customXml/itemProps2.xml><?xml version="1.0" encoding="utf-8"?>
-<ds:datastoreItem xmlns:ds="http://schemas.openxmlformats.org/officeDocument/2006/customXml" ds:itemID="{DFE2807C-7CBC-4D53-A3DD-7AE62A49A810}">
+<ds:datastoreItem xmlns:ds="http://schemas.openxmlformats.org/officeDocument/2006/customXml" ds:itemID="{F9D3A852-1806-8341-A2A9-C2E0864045AC}">
   <ds:schemaRefs>
-    <ds:schemaRef ds:uri="http://schemas.microsoft.com/sharepoint/v3/contenttype/forms"/>
+    <ds:schemaRef ds:uri="http://schemas.openxmlformats.org/officeDocument/2006/bibliography"/>
   </ds:schemaRefs>
 </ds:datastoreItem>
 </file>
@@ -8916,9 +8737,11 @@
 </file>
 
 <file path=customXml/itemProps4.xml><?xml version="1.0" encoding="utf-8"?>
-<ds:datastoreItem xmlns:ds="http://schemas.openxmlformats.org/officeDocument/2006/customXml" ds:itemID="{F9D3A852-1806-8341-A2A9-C2E0864045AC}">
+<ds:datastoreItem xmlns:ds="http://schemas.openxmlformats.org/officeDocument/2006/customXml" ds:itemID="{BCBBEC62-780F-47CE-A858-C556351822F4}">
   <ds:schemaRefs>
-    <ds:schemaRef ds:uri="http://schemas.openxmlformats.org/officeDocument/2006/bibliography"/>
+    <ds:schemaRef ds:uri="http://schemas.microsoft.com/office/2006/metadata/properties"/>
+    <ds:schemaRef ds:uri="http://schemas.microsoft.com/office/infopath/2007/PartnerControls"/>
+    <ds:schemaRef ds:uri="a70d8763-7c41-4a73-b44e-b9180792dbd4"/>
   </ds:schemaRefs>
 </ds:datastoreItem>
 </file>
</xml_diff>